<commit_message>
Changed blog (glospickle now has authority), added Freedom Leisure to my maps, removed coaching and amended the schedule to include freedom leisure.  Removed links to PB Table
</commit_message>
<xml_diff>
--- a/Pickleball Website Spec.docx
+++ b/Pickleball Website Spec.docx
@@ -146,7 +146,21 @@
               <w:cnfStyle w:val="000000000000" w:firstRow="0" w:lastRow="0" w:firstColumn="0" w:lastColumn="0" w:oddVBand="0" w:evenVBand="0" w:oddHBand="0" w:evenHBand="0" w:firstRowFirstColumn="0" w:firstRowLastColumn="0" w:lastRowFirstColumn="0" w:lastRowLastColumn="0"/>
             </w:pPr>
             <w:r>
-              <w:t>Ownership given to glospickle.com</w:t>
+              <w:t xml:space="preserve">Ownership </w:t>
+            </w:r>
+            <w:r>
+              <w:t xml:space="preserve">to be given to:- </w:t>
+            </w:r>
+          </w:p>
+          <w:p>
+            <w:pPr>
+              <w:cnfStyle w:val="000000000000" w:firstRow="0" w:lastRow="0" w:firstColumn="0" w:lastColumn="0" w:oddVBand="0" w:evenVBand="0" w:oddHBand="0" w:evenHBand="0" w:firstRowFirstColumn="0" w:firstRowLastColumn="0" w:lastRowFirstColumn="0" w:lastRowLastColumn="0"/>
+            </w:pPr>
+            <w:r>
+              <w:rPr>
+                <w:highlight w:val="yellow"/>
+              </w:rPr>
+              <w:t>glospickle@gmail.com?</w:t>
             </w:r>
           </w:p>
         </w:tc>
@@ -212,11 +226,9 @@
             <w:pPr>
               <w:cnfStyle w:val="000000100000" w:firstRow="0" w:lastRow="0" w:firstColumn="0" w:lastColumn="0" w:oddVBand="0" w:evenVBand="0" w:oddHBand="1" w:evenHBand="0" w:firstRowFirstColumn="0" w:firstRowLastColumn="0" w:lastRowFirstColumn="0" w:lastRowLastColumn="0"/>
             </w:pPr>
-            <w:proofErr w:type="spellStart"/>
             <w:r>
               <w:t>Github</w:t>
             </w:r>
-            <w:proofErr w:type="spellEnd"/>
           </w:p>
         </w:tc>
       </w:tr>
@@ -241,7 +253,7 @@
               <w:cnfStyle w:val="000000000000" w:firstRow="0" w:lastRow="0" w:firstColumn="0" w:lastColumn="0" w:oddVBand="0" w:evenVBand="0" w:oddHBand="0" w:evenHBand="0" w:firstRowFirstColumn="0" w:firstRowLastColumn="0" w:lastRowFirstColumn="0" w:lastRowLastColumn="0"/>
             </w:pPr>
             <w:r>
-              <w:t>Glospickle.com</w:t>
+              <w:t>pickleballgloucestershire</w:t>
             </w:r>
           </w:p>
         </w:tc>
@@ -286,6 +298,44 @@
           </w:tcPr>
           <w:p>
             <w:r>
+              <w:t>Members</w:t>
+            </w:r>
+          </w:p>
+        </w:tc>
+        <w:tc>
+          <w:tcPr>
+            <w:tcW w:w="7371" w:type="dxa"/>
+          </w:tcPr>
+          <w:p>
+            <w:pPr>
+              <w:cnfStyle w:val="000000000000" w:firstRow="0" w:lastRow="0" w:firstColumn="0" w:lastColumn="0" w:oddVBand="0" w:evenVBand="0" w:oddHBand="0" w:evenHBand="0" w:firstRowFirstColumn="0" w:firstRowLastColumn="0" w:lastRowFirstColumn="0" w:lastRowLastColumn="0"/>
+            </w:pPr>
+            <w:r>
+              <w:t>Gav, Jo and Ian</w:t>
+            </w:r>
+          </w:p>
+          <w:p>
+            <w:pPr>
+              <w:cnfStyle w:val="000000000000" w:firstRow="0" w:lastRow="0" w:firstColumn="0" w:lastColumn="0" w:oddVBand="0" w:evenVBand="0" w:oddHBand="0" w:evenHBand="0" w:firstRowFirstColumn="0" w:firstRowLastColumn="0" w:lastRowFirstColumn="0" w:lastRowLastColumn="0"/>
+            </w:pPr>
+            <w:r>
+              <w:t>Ian doesn’t have the account yet – still owned by Gav</w:t>
+            </w:r>
+          </w:p>
+        </w:tc>
+      </w:tr>
+      <w:tr>
+        <w:trPr>
+          <w:cnfStyle w:val="000000100000" w:firstRow="0" w:lastRow="0" w:firstColumn="0" w:lastColumn="0" w:oddVBand="0" w:evenVBand="0" w:oddHBand="1" w:evenHBand="0" w:firstRowFirstColumn="0" w:firstRowLastColumn="0" w:lastRowFirstColumn="0" w:lastRowLastColumn="0"/>
+          <w:trHeight w:val="70"/>
+        </w:trPr>
+        <w:tc>
+          <w:tcPr>
+            <w:cnfStyle w:val="001000000000" w:firstRow="0" w:lastRow="0" w:firstColumn="1" w:lastColumn="0" w:oddVBand="0" w:evenVBand="0" w:oddHBand="0" w:evenHBand="0" w:firstRowFirstColumn="0" w:firstRowLastColumn="0" w:lastRowFirstColumn="0" w:lastRowLastColumn="0"/>
+            <w:tcW w:w="2547" w:type="dxa"/>
+          </w:tcPr>
+          <w:p>
+            <w:r>
               <w:t>Comment</w:t>
             </w:r>
           </w:p>
@@ -296,7 +346,7 @@
           </w:tcPr>
           <w:p>
             <w:pPr>
-              <w:cnfStyle w:val="000000000000" w:firstRow="0" w:lastRow="0" w:firstColumn="0" w:lastColumn="0" w:oddVBand="0" w:evenVBand="0" w:oddHBand="0" w:evenHBand="0" w:firstRowFirstColumn="0" w:firstRowLastColumn="0" w:lastRowFirstColumn="0" w:lastRowLastColumn="0"/>
+              <w:cnfStyle w:val="000000100000" w:firstRow="0" w:lastRow="0" w:firstColumn="0" w:lastColumn="0" w:oddVBand="0" w:evenVBand="0" w:oddHBand="1" w:evenHBand="0" w:firstRowFirstColumn="0" w:firstRowLastColumn="0" w:lastRowFirstColumn="0" w:lastRowLastColumn="0"/>
             </w:pPr>
             <w:r>
               <w:t>Account to be given to Ian/Committee</w:t>
@@ -374,15 +424,7 @@
               <w:cnfStyle w:val="000000100000" w:firstRow="0" w:lastRow="0" w:firstColumn="0" w:lastColumn="0" w:oddVBand="0" w:evenVBand="0" w:oddHBand="1" w:evenHBand="0" w:firstRowFirstColumn="0" w:firstRowLastColumn="0" w:lastRowFirstColumn="0" w:lastRowLastColumn="0"/>
             </w:pPr>
             <w:r>
-              <w:t xml:space="preserve">Plain or </w:t>
-            </w:r>
-            <w:proofErr w:type="spellStart"/>
-            <w:r>
-              <w:t>piccie</w:t>
-            </w:r>
-            <w:proofErr w:type="spellEnd"/>
-            <w:r>
-              <w:t xml:space="preserve"> background – need to be careful about </w:t>
+              <w:t xml:space="preserve">Plain or piccie background – need to be careful about </w:t>
             </w:r>
             <w:r>
               <w:t>accessibility</w:t>
@@ -529,15 +571,10 @@
               <w:cnfStyle w:val="000000000000" w:firstRow="0" w:lastRow="0" w:firstColumn="0" w:lastColumn="0" w:oddVBand="0" w:evenVBand="0" w:oddHBand="0" w:evenHBand="0" w:firstRowFirstColumn="0" w:firstRowLastColumn="0" w:lastRowFirstColumn="0" w:lastRowLastColumn="0"/>
             </w:pPr>
             <w:r>
-              <w:t xml:space="preserve">View – live leaderboard – need link to </w:t>
-            </w:r>
-            <w:proofErr w:type="spellStart"/>
-            <w:r>
-              <w:t>PBTable</w:t>
-            </w:r>
-            <w:proofErr w:type="spellEnd"/>
-            <w:r>
-              <w:t xml:space="preserve"> – don’t know whether you can do this without logon – what security is there?</w:t>
+              <w:t>View – live leaderboard – need link to PBTable – don’t know whether you can do this without logon – what security is there?</w:t>
+            </w:r>
+            <w:r>
+              <w:t xml:space="preserve"> GDPR concerns</w:t>
             </w:r>
           </w:p>
           <w:p>
@@ -545,15 +582,7 @@
               <w:cnfStyle w:val="000000000000" w:firstRow="0" w:lastRow="0" w:firstColumn="0" w:lastColumn="0" w:oddVBand="0" w:evenVBand="0" w:oddHBand="0" w:evenHBand="0" w:firstRowFirstColumn="0" w:firstRowLastColumn="0" w:lastRowFirstColumn="0" w:lastRowLastColumn="0"/>
             </w:pPr>
             <w:r>
-              <w:t xml:space="preserve">Register on </w:t>
-            </w:r>
-            <w:proofErr w:type="spellStart"/>
-            <w:r>
-              <w:t>Picklebook</w:t>
-            </w:r>
-            <w:proofErr w:type="spellEnd"/>
-            <w:r>
-              <w:t xml:space="preserve"> – do we want this?</w:t>
+              <w:t>Register on Picklebook – do we want this?</w:t>
             </w:r>
           </w:p>
         </w:tc>
@@ -725,15 +754,7 @@
               <w:cnfStyle w:val="000000100000" w:firstRow="0" w:lastRow="0" w:firstColumn="0" w:lastColumn="0" w:oddVBand="0" w:evenVBand="0" w:oddHBand="1" w:evenHBand="0" w:firstRowFirstColumn="0" w:firstRowLastColumn="0" w:lastRowFirstColumn="0" w:lastRowLastColumn="0"/>
             </w:pPr>
             <w:r>
-              <w:t xml:space="preserve">News &amp; Social Updates – coming from </w:t>
-            </w:r>
-            <w:proofErr w:type="spellStart"/>
-            <w:r>
-              <w:t>facebook</w:t>
-            </w:r>
-            <w:proofErr w:type="spellEnd"/>
-            <w:r>
-              <w:t xml:space="preserve"> feed (see below)</w:t>
+              <w:t>News &amp; Social Updates – coming from facebook feed (see below)</w:t>
             </w:r>
           </w:p>
           <w:p>
@@ -777,13 +798,8 @@
             <w:pPr>
               <w:cnfStyle w:val="000000000000" w:firstRow="0" w:lastRow="0" w:firstColumn="0" w:lastColumn="0" w:oddVBand="0" w:evenVBand="0" w:oddHBand="0" w:evenHBand="0" w:firstRowFirstColumn="0" w:firstRowLastColumn="0" w:lastRowFirstColumn="0" w:lastRowLastColumn="0"/>
             </w:pPr>
-            <w:proofErr w:type="gramStart"/>
-            <w:r>
-              <w:t>Concerned  that</w:t>
-            </w:r>
-            <w:proofErr w:type="gramEnd"/>
-            <w:r>
-              <w:t xml:space="preserve"> other clubs locally might duplicate Pickleball England club finder</w:t>
+            <w:r>
+              <w:t>Concerned  that other clubs locally might duplicate Pickleball England club finder</w:t>
             </w:r>
           </w:p>
           <w:p>
@@ -791,6 +807,7 @@
               <w:cnfStyle w:val="000000000000" w:firstRow="0" w:lastRow="0" w:firstColumn="0" w:lastColumn="0" w:oddVBand="0" w:evenVBand="0" w:oddHBand="0" w:evenHBand="0" w:firstRowFirstColumn="0" w:firstRowLastColumn="0" w:lastRowFirstColumn="0" w:lastRowLastColumn="0"/>
             </w:pPr>
             <w:r>
+              <w:lastRenderedPageBreak/>
               <w:t>Need to ensure that we have criteria for when included/not included</w:t>
             </w:r>
           </w:p>
@@ -808,6 +825,7 @@
           </w:tcPr>
           <w:p>
             <w:r>
+              <w:lastRenderedPageBreak/>
               <w:t>Policies</w:t>
             </w:r>
           </w:p>
@@ -943,17 +961,7 @@
               <w:cnfStyle w:val="000000100000" w:firstRow="0" w:lastRow="0" w:firstColumn="0" w:lastColumn="0" w:oddVBand="0" w:evenVBand="0" w:oddHBand="1" w:evenHBand="0" w:firstRowFirstColumn="0" w:firstRowLastColumn="0" w:lastRowFirstColumn="0" w:lastRowLastColumn="0"/>
             </w:pPr>
             <w:r>
-              <w:t xml:space="preserve">All </w:t>
-            </w:r>
-            <w:proofErr w:type="spellStart"/>
-            <w:proofErr w:type="gramStart"/>
-            <w:r>
-              <w:t>non regular</w:t>
-            </w:r>
-            <w:proofErr w:type="spellEnd"/>
-            <w:proofErr w:type="gramEnd"/>
-            <w:r>
-              <w:t xml:space="preserve"> events will go here</w:t>
+              <w:t>All non regular events will go here</w:t>
             </w:r>
           </w:p>
           <w:p>
@@ -1005,13 +1013,8 @@
             <w:pPr>
               <w:cnfStyle w:val="000000000000" w:firstRow="0" w:lastRow="0" w:firstColumn="0" w:lastColumn="0" w:oddVBand="0" w:evenVBand="0" w:oddHBand="0" w:evenHBand="0" w:firstRowFirstColumn="0" w:firstRowLastColumn="0" w:lastRowFirstColumn="0" w:lastRowLastColumn="0"/>
             </w:pPr>
-            <w:proofErr w:type="spellStart"/>
-            <w:r>
-              <w:t>Elfsight</w:t>
-            </w:r>
-            <w:proofErr w:type="spellEnd"/>
-            <w:r>
-              <w:t xml:space="preserve"> – free</w:t>
+            <w:r>
+              <w:t>Elfsight – free</w:t>
             </w:r>
           </w:p>
           <w:p>
@@ -1093,23 +1096,7 @@
               <w:cnfStyle w:val="000000100000" w:firstRow="0" w:lastRow="0" w:firstColumn="0" w:lastColumn="0" w:oddVBand="0" w:evenVBand="0" w:oddHBand="1" w:evenHBand="0" w:firstRowFirstColumn="0" w:firstRowLastColumn="0" w:lastRowFirstColumn="0" w:lastRowLastColumn="0"/>
             </w:pPr>
             <w:r>
-              <w:t xml:space="preserve">Using </w:t>
-            </w:r>
-            <w:proofErr w:type="spellStart"/>
-            <w:r>
-              <w:t>pickleballgloucestershire</w:t>
-            </w:r>
-            <w:proofErr w:type="spellEnd"/>
-            <w:r>
-              <w:t xml:space="preserve"> – </w:t>
-            </w:r>
-            <w:proofErr w:type="spellStart"/>
-            <w:r>
-              <w:t>facebook</w:t>
-            </w:r>
-            <w:proofErr w:type="spellEnd"/>
-            <w:r>
-              <w:t xml:space="preserve"> page – set up by Jo</w:t>
+              <w:t>Using pickleballgloucestershire – facebook page – set up by Jo</w:t>
             </w:r>
           </w:p>
           <w:p>
@@ -1125,15 +1112,7 @@
               <w:cnfStyle w:val="000000100000" w:firstRow="0" w:lastRow="0" w:firstColumn="0" w:lastColumn="0" w:oddVBand="0" w:evenVBand="0" w:oddHBand="1" w:evenHBand="0" w:firstRowFirstColumn="0" w:firstRowLastColumn="0" w:lastRowFirstColumn="0" w:lastRowLastColumn="0"/>
             </w:pPr>
             <w:r>
-              <w:t xml:space="preserve">Widgets can’t pull from groups – </w:t>
-            </w:r>
-            <w:proofErr w:type="spellStart"/>
-            <w:r>
-              <w:t>facebook</w:t>
-            </w:r>
-            <w:proofErr w:type="spellEnd"/>
-            <w:r>
-              <w:t xml:space="preserve"> security </w:t>
+              <w:t xml:space="preserve">Widgets can’t pull from groups – facebook security </w:t>
             </w:r>
           </w:p>
         </w:tc>
@@ -1161,13 +1140,8 @@
             <w:pPr>
               <w:cnfStyle w:val="000000000000" w:firstRow="0" w:lastRow="0" w:firstColumn="0" w:lastColumn="0" w:oddVBand="0" w:evenVBand="0" w:oddHBand="0" w:evenHBand="0" w:firstRowFirstColumn="0" w:firstRowLastColumn="0" w:lastRowFirstColumn="0" w:lastRowLastColumn="0"/>
             </w:pPr>
-            <w:proofErr w:type="spellStart"/>
-            <w:r>
-              <w:t>Elfsight</w:t>
-            </w:r>
-            <w:proofErr w:type="spellEnd"/>
-            <w:r>
-              <w:t xml:space="preserve"> – free</w:t>
+            <w:r>
+              <w:t>Elfsight – free</w:t>
             </w:r>
           </w:p>
           <w:p>
@@ -1257,15 +1231,7 @@
               <w:cnfStyle w:val="000000100000" w:firstRow="0" w:lastRow="0" w:firstColumn="0" w:lastColumn="0" w:oddVBand="0" w:evenVBand="0" w:oddHBand="1" w:evenHBand="0" w:firstRowFirstColumn="0" w:firstRowLastColumn="0" w:lastRowFirstColumn="0" w:lastRowLastColumn="0"/>
             </w:pPr>
             <w:r>
-              <w:t xml:space="preserve">Using </w:t>
-            </w:r>
-            <w:proofErr w:type="spellStart"/>
-            <w:r>
-              <w:t>pickleballgloucestershire</w:t>
-            </w:r>
-            <w:proofErr w:type="spellEnd"/>
-            <w:r>
-              <w:t xml:space="preserve"> – blogger – set up by Jo</w:t>
+              <w:t>Using pickleballgloucestershire – blogger – set up by Jo</w:t>
             </w:r>
           </w:p>
           <w:p>
@@ -1326,11 +1292,9 @@
             <w:tcW w:w="2547" w:type="dxa"/>
           </w:tcPr>
           <w:p>
-            <w:proofErr w:type="spellStart"/>
             <w:r>
               <w:t>myMaps</w:t>
             </w:r>
-            <w:proofErr w:type="spellEnd"/>
           </w:p>
         </w:tc>
         <w:tc>
@@ -1342,15 +1306,7 @@
               <w:cnfStyle w:val="000000100000" w:firstRow="0" w:lastRow="0" w:firstColumn="0" w:lastColumn="0" w:oddVBand="0" w:evenVBand="0" w:oddHBand="1" w:evenHBand="0" w:firstRowFirstColumn="0" w:firstRowLastColumn="0" w:lastRowFirstColumn="0" w:lastRowLastColumn="0"/>
             </w:pPr>
             <w:r>
-              <w:t xml:space="preserve">Using </w:t>
-            </w:r>
-            <w:proofErr w:type="spellStart"/>
-            <w:r>
-              <w:t>pickleballgloucestershire</w:t>
-            </w:r>
-            <w:proofErr w:type="spellEnd"/>
-            <w:r>
-              <w:t xml:space="preserve"> </w:t>
+              <w:t xml:space="preserve">Using pickleballgloucestershire </w:t>
             </w:r>
           </w:p>
           <w:p>
@@ -1381,6 +1337,9 @@
             </w:pPr>
             <w:r>
               <w:t>Couldn’t use google maps directly due to security restrictions/payments</w:t>
+            </w:r>
+            <w:r>
+              <w:t>/ needed credit card details and I didn’t want to share mine</w:t>
             </w:r>
           </w:p>
         </w:tc>
@@ -2877,7 +2836,10 @@
   <w:rsids>
     <w:rsidRoot w:val="001A2014"/>
     <w:rsid w:val="001A2014"/>
+    <w:rsid w:val="00612327"/>
     <w:rsid w:val="006A65C6"/>
+    <w:rsid w:val="00825630"/>
+    <w:rsid w:val="00CE2D55"/>
     <w:rsid w:val="00F71C61"/>
   </w:rsids>
   <m:mathPr>
@@ -3329,10 +3291,6 @@
     <w:semiHidden/>
     <w:unhideWhenUsed/>
   </w:style>
-  <w:style w:type="paragraph" w:customStyle="1" w:styleId="8B4262BE6AF342C494CDD9563CEF820A">
-    <w:name w:val="8B4262BE6AF342C494CDD9563CEF820A"/>
-    <w:rsid w:val="001A2014"/>
-  </w:style>
   <w:style w:type="paragraph" w:customStyle="1" w:styleId="D5C4B305671D4E90A7418575D6478BF6">
     <w:name w:val="D5C4B305671D4E90A7418575D6478BF6"/>
     <w:rsid w:val="001A2014"/>

</xml_diff>